<commit_message>
v445.9.2: Anhangszuordnung und Auslandsfristen absichern
FinTech-Verfahrensakte, sichere Zuordnung von Hauptdokument und Nachrichtenanhängen sowie konsistente Auslandsfristen veröffentlichen. Regressionen, Quellenprüfung und reproduzierbare Verzeichnisse sind abgeglichen.
</commit_message>
<xml_diff>
--- a/testakten/fintech-darlehen-vertragsuebernahme-bremen/02_klageerwiderung/00_Klageerwiderung_20260928.docx
+++ b/testakten/fintech-darlehen-vertragsuebernahme-bremen/02_klageerwiderung/00_Klageerwiderung_20260928.docx
@@ -50,7 +50,7 @@
     </w:p>
     <w:p>
       <w:r>
-        <w:t>Die Verteidigungsanzeige datiert vom 22. September 2026; die Erwiderung erfolgt innerhalb der bis zum 20. Oktober 2026 laufenden Frist. Die Beklagte war ursprüngliche Darlehensgeberin, aber nicht Empfängerin der angefochtenen Zins- und Tilgungsleistungen. Die Vertragsübernahme beseitigt dagegen nicht ohne Weiteres eine etwaige eigene Haftung aus dem Verhalten der Beklagten vor ihrem Ausscheiden. Auch diesem Vorwurf tritt die Beklagte gesondert entgegen.</w:t>
+        <w:t>Die Verteidigungsanzeige datiert vom 22. September 2026; die Erwiderung erfolgt innerhalb der bis zum 29. Oktober 2026 laufenden Frist. Die Beklagte war ursprüngliche Darlehensgeberin, aber nicht Empfängerin der angefochtenen Zins- und Tilgungsleistungen. Die Vertragsübernahme beseitigt dagegen nicht ohne Weiteres eine etwaige eigene Haftung aus dem Verhalten der Beklagten vor ihrem Ausscheiden. Auch diesem Vorwurf tritt die Beklagte gesondert entgegen.</w:t>
       </w:r>
     </w:p>
     <w:p>
@@ -634,7 +634,7 @@
         <w:pStyle w:val="Heading1"/>
       </w:pPr>
       <w:r>
-        <w:t>19. Beweisangebote und Gegenstand der weiteren Aufklärung</w:t>
+        <w:t>19. Beweisangebote und weitere Verfahrensführung</w:t>
       </w:r>
     </w:p>
     <w:p>
@@ -655,6 +655,11 @@
     <w:p>
       <w:r>
         <w:t>Sollte das Gericht weiteren Vortrag zur räumlichen Anknüpfung eines autonomen Anspruchs, zur Bedeutung einer einzelnen Vertragsbestimmung oder zu einem bestimmten mittelbaren Vermögensvorteil für erforderlich halten, wird um einen gezielten Hinweis nach Paragraf 139 ZPO und Gelegenheit zur Stellungnahme gebeten. Die Beklagte wird zu konkretisierten Tatsachenbehauptungen nach Paragraf 138 ZPO Stellung nehmen. Sie beantragt keine Beweisausforschung der Klägerin, sondern eine auf die entscheidungserheblichen Vorgänge begrenzte Aufklärung.</w:t>
+      </w:r>
+    </w:p>
+    <w:p>
+      <w:r>
+        <w:t>Einer Entscheidung durch den Einzelrichter stehen aus Sicht der Beklagten die besonderen rechtlichen Schwierigkeiten der Verbindung grenzüberschreitender Anfechtungs-, Vertrags- und Deliktsansprüche entgegen. Gegen eine Videoverhandlung zur Erörterung bestehen derzeit keine Bedenken; über eine etwaige Beweisaufnahme ist gesondert zu befinden. Die internationale Zuständigkeitsrüge bleibt von dieser Stellungnahme nach Paragraf 277 Absatz 1 Satz 2 ZPO unberührt.</w:t>
       </w:r>
     </w:p>
     <w:p>

</xml_diff>